<commit_message>
did the basic interface for the main code
</commit_message>
<xml_diff>
--- a/Doc/Step_by_step_process.docx
+++ b/Doc/Step_by_step_process.docx
@@ -16682,20 +16682,12 @@
         </w:rPr>
         <w:t xml:space="preserve">Please give your answer strictly as a python dictionary, with no additional text or characters. Use </w:t>
       </w:r>
-      <w:proofErr w:type="gramStart"/>
-      <w:r>
-        <w:rPr>
-          <w:lang w:val="en-US"/>
-        </w:rPr>
-        <w:t xml:space="preserve">exactly </w:t>
-      </w:r>
       <w:r>
         <w:rPr>
           <w:lang w:val="en-US"/>
         </w:rPr>
         <w:t>the same</w:t>
       </w:r>
-      <w:proofErr w:type="gramEnd"/>
       <w:r>
         <w:rPr>
           <w:lang w:val="en-US"/>
@@ -17347,21 +17339,19 @@
               <w:rPr>
                 <w:lang w:val="en-US"/>
               </w:rPr>
-              <w:t xml:space="preserve">    '</w:t>
-            </w:r>
-            <w:proofErr w:type="gramStart"/>
-            <w:r>
-              <w:rPr>
-                <w:lang w:val="en-US"/>
-              </w:rPr>
-              <w:t>reason</w:t>
-            </w:r>
-            <w:proofErr w:type="gramEnd"/>
-            <w:r>
-              <w:rPr>
-                <w:lang w:val="en-US"/>
-              </w:rPr>
-              <w:t>: '&lt;here you write the reasons behind your decisions&gt;'</w:t>
+              <w:t xml:space="preserve">    'reason'</w:t>
+            </w:r>
+            <w:r>
+              <w:rPr>
+                <w:lang w:val="en-US"/>
+              </w:rPr>
+              <w:t xml:space="preserve">: </w:t>
+            </w:r>
+            <w:r>
+              <w:rPr>
+                <w:lang w:val="en-US"/>
+              </w:rPr>
+              <w:t>&lt;here you write the reasons behind your decisions&gt;'</w:t>
             </w:r>
           </w:p>
           <w:p>
@@ -19275,21 +19265,19 @@
               <w:rPr>
                 <w:lang w:val="en-US"/>
               </w:rPr>
-              <w:t xml:space="preserve">    '</w:t>
-            </w:r>
-            <w:proofErr w:type="gramStart"/>
-            <w:r>
-              <w:rPr>
-                <w:lang w:val="en-US"/>
-              </w:rPr>
-              <w:t>reason</w:t>
-            </w:r>
-            <w:proofErr w:type="gramEnd"/>
-            <w:r>
-              <w:rPr>
-                <w:lang w:val="en-US"/>
-              </w:rPr>
-              <w:t>: '&lt;here you write the reasons behind your decisions&gt;'</w:t>
+              <w:t xml:space="preserve">    'reason '</w:t>
+            </w:r>
+            <w:r>
+              <w:rPr>
+                <w:lang w:val="en-US"/>
+              </w:rPr>
+              <w:t xml:space="preserve">: </w:t>
+            </w:r>
+            <w:r>
+              <w:rPr>
+                <w:lang w:val="en-US"/>
+              </w:rPr>
+              <w:t>&lt;here you write the reasons behind your decisions&gt;'</w:t>
             </w:r>
           </w:p>
           <w:p>
@@ -19376,6 +19364,12 @@
               <w:br/>
               <w:t>{</w:t>
             </w:r>
+            <w:r>
+              <w:rPr>
+                <w:lang w:val="en-US"/>
+              </w:rPr>
+              <w:t xml:space="preserve"> </w:t>
+            </w:r>
           </w:p>
           <w:p>
             <w:pPr>
@@ -19511,7 +19505,19 @@
               <w:rPr>
                 <w:lang w:val="en-US"/>
               </w:rPr>
-              <w:t>: '&lt;here you write the reasons behind your decisions&gt;'</w:t>
+              <w:t>:</w:t>
+            </w:r>
+            <w:r>
+              <w:rPr>
+                <w:lang w:val="en-US"/>
+              </w:rPr>
+              <w:t xml:space="preserve"> </w:t>
+            </w:r>
+            <w:r>
+              <w:rPr>
+                <w:lang w:val="en-US"/>
+              </w:rPr>
+              <w:t>'&lt;here you write the reasons behind your decisions&gt;'</w:t>
             </w:r>
           </w:p>
           <w:p>
@@ -20285,6 +20291,13 @@
     <w:p>
       <w:pPr>
         <w:rPr>
+          <w:lang w:val="es-ES"/>
+        </w:rPr>
+      </w:pPr>
+    </w:p>
+    <w:p>
+      <w:pPr>
+        <w:rPr>
           <w:b/>
           <w:bCs/>
           <w:lang w:val="en-US"/>
@@ -20373,6 +20386,14 @@
     </w:p>
     <w:p>
       <w:pPr>
+        <w:jc w:val="both"/>
+        <w:rPr>
+          <w:lang w:val="en-US"/>
+        </w:rPr>
+      </w:pPr>
+    </w:p>
+    <w:p>
+      <w:pPr>
         <w:rPr>
           <w:b/>
           <w:bCs/>
@@ -20470,20 +20491,23 @@
     </w:p>
     <w:p>
       <w:r>
-        <w:t>In the main survey, participants answered questions about their own AI reliance and frequency of use, as well as their perceptions of their peers’ AI usage. The results revealed a statistically significant gap: participants reported substantially lower personal AI usage compared with the level of usage they attributed to their peers.</w:t>
-      </w:r>
-    </w:p>
-    <w:p>
-      <w:pPr>
-        <w:rPr>
-          <w:lang w:val="en-US"/>
-        </w:rPr>
-      </w:pPr>
-      <w:r>
-        <w:rPr>
-          <w:lang w:val="en-US"/>
-        </w:rPr>
+        <w:t xml:space="preserve">In the main survey, participants answered questions about their own AI reliance and frequency of use, as well as their perceptions of their peers’ AI usage. The results revealed a statistically </w:t>
+      </w:r>
+      <w:r>
         <w:lastRenderedPageBreak/>
+        <w:t>significant gap: participants reported substantially lower personal AI usage compared with the level of usage they attributed to their peers.</w:t>
+      </w:r>
+    </w:p>
+    <w:p>
+      <w:pPr>
+        <w:rPr>
+          <w:lang w:val="en-US"/>
+        </w:rPr>
+      </w:pPr>
+      <w:r>
+        <w:rPr>
+          <w:lang w:val="en-US"/>
+        </w:rPr>
         <w:t xml:space="preserve">In the follow-up survey, a separate sample of </w:t>
       </w:r>
       <w:r>
@@ -20504,6 +20528,13 @@
         </w:rPr>
         <w:t>about their explanations for this gap, such as social desirability bias or lack of knowledge about others’ AI use.</w:t>
       </w:r>
+    </w:p>
+    <w:p>
+      <w:pPr>
+        <w:rPr>
+          <w:lang w:val="en-US"/>
+        </w:rPr>
+      </w:pPr>
     </w:p>
     <w:p>
       <w:pPr>
@@ -21147,6 +21178,14 @@
     </w:p>
     <w:p>
       <w:pPr>
+        <w:pStyle w:val="ListParagraph"/>
+        <w:rPr>
+          <w:lang w:val="en-US"/>
+        </w:rPr>
+      </w:pPr>
+    </w:p>
+    <w:p>
+      <w:pPr>
         <w:rPr>
           <w:b/>
           <w:bCs/>
@@ -21737,6 +21776,7 @@
         <w:rPr>
           <w:lang w:val="en-US"/>
         </w:rPr>
+        <w:lastRenderedPageBreak/>
         <w:t>'</w:t>
       </w:r>
       <w:r>
@@ -21954,7 +21994,6 @@
         <w:rPr>
           <w:lang w:val="en-US"/>
         </w:rPr>
-        <w:lastRenderedPageBreak/>
         <w:t>'</w:t>
       </w:r>
       <w:r>
@@ -22469,6 +22508,15 @@
         </w:rPr>
         <w:t>}</w:t>
       </w:r>
+    </w:p>
+    <w:p>
+      <w:pPr>
+        <w:rPr>
+          <w:b/>
+          <w:bCs/>
+          <w:lang w:val="en-US"/>
+        </w:rPr>
+      </w:pPr>
     </w:p>
     <w:p>
       <w:pPr>
@@ -23091,6 +23139,7 @@
               <w:rPr>
                 <w:lang w:val="en-US"/>
               </w:rPr>
+              <w:lastRenderedPageBreak/>
               <w:t xml:space="preserve">    'AI discussion priming ': 'FALSE',</w:t>
             </w:r>
           </w:p>
@@ -23198,7 +23247,6 @@
               <w:rPr>
                 <w:lang w:val="en-US"/>
               </w:rPr>
-              <w:lastRenderedPageBreak/>
               <w:t xml:space="preserve">    'truthful': 'FALSE'</w:t>
             </w:r>
           </w:p>
@@ -24032,7 +24080,6 @@
               <w:rPr>
                 <w:lang w:val="en-US"/>
               </w:rPr>
-              <w:lastRenderedPageBreak/>
               <w:br/>
             </w:r>
             <w:r>
@@ -24408,7 +24455,6 @@
                 <w:iCs/>
                 <w:lang w:val="en-US"/>
               </w:rPr>
-              <w:lastRenderedPageBreak/>
               <w:t xml:space="preserve">few-shot </w:t>
             </w:r>
             <w:proofErr w:type="spellStart"/>
@@ -24852,6 +24898,7 @@
               <w:rPr>
                 <w:lang w:val="en-US"/>
               </w:rPr>
+              <w:lastRenderedPageBreak/>
               <w:t xml:space="preserve">    'uninformative': 'T',</w:t>
             </w:r>
           </w:p>
@@ -24936,7 +24983,6 @@
               <w:rPr>
                 <w:lang w:val="en-US"/>
               </w:rPr>
-              <w:lastRenderedPageBreak/>
               <w:t xml:space="preserve">    '</w:t>
             </w:r>
             <w:proofErr w:type="gramStart"/>
@@ -25678,6 +25724,7 @@
               <w:rPr>
                 <w:lang w:val="en-US"/>
               </w:rPr>
+              <w:lastRenderedPageBreak/>
               <w:br/>
               <w:t>The classification should be:</w:t>
             </w:r>
@@ -25718,7 +25765,6 @@
               <w:rPr>
                 <w:lang w:val="en-US"/>
               </w:rPr>
-              <w:lastRenderedPageBreak/>
               <w:t xml:space="preserve">    ' SDB ': 'FALSE',</w:t>
             </w:r>
           </w:p>

</xml_diff>

<commit_message>
changed the chat gpt version. I also completed the code needed coming up with categories plus the classification task after that step
</commit_message>
<xml_diff>
--- a/Doc/Step_by_step_process.docx
+++ b/Doc/Step_by_step_process.docx
@@ -207,7 +207,13 @@
         </w:numPr>
       </w:pPr>
       <w:r>
-        <w:t>Usar {0,0.2,0.25, 0.5, 0.6, 0.7, 1}</w:t>
+        <w:t>Usar {0,0.25, 0.5, 0.7</w:t>
+      </w:r>
+      <w:r>
+        <w:t>5</w:t>
+      </w:r>
+      <w:r>
+        <w:t>, 1}</w:t>
       </w:r>
     </w:p>
     <w:p/>

</xml_diff>

<commit_message>
did the test to connect to gemini and actually edited the main code (needs to be tested)
</commit_message>
<xml_diff>
--- a/Doc/Step_by_step_process.docx
+++ b/Doc/Step_by_step_process.docx
@@ -24,6 +24,23 @@
           <w:lang w:val="es-ES_tradnl"/>
         </w:rPr>
       </w:pPr>
+      <w:r>
+        <w:rPr>
+          <w:b/>
+          <w:bCs/>
+          <w:lang w:val="es-ES"/>
+        </w:rPr>
+        <w:tab/>
+      </w:r>
+    </w:p>
+    <w:p>
+      <w:pPr>
+        <w:rPr>
+          <w:b/>
+          <w:bCs/>
+          <w:lang w:val="es-ES"/>
+        </w:rPr>
+      </w:pPr>
       <w:proofErr w:type="spellStart"/>
       <w:r>
         <w:rPr>
@@ -94,6 +111,15 @@
         <w:rPr>
           <w:b/>
           <w:bCs/>
+          <w:lang w:val="es-ES_tradnl"/>
+        </w:rPr>
+      </w:pPr>
+    </w:p>
+    <w:p>
+      <w:pPr>
+        <w:rPr>
+          <w:b/>
+          <w:bCs/>
           <w:lang w:val="en-US"/>
         </w:rPr>
       </w:pPr>
@@ -105,16 +131,14 @@
         </w:rPr>
         <w:t xml:space="preserve">Relevant details to </w:t>
       </w:r>
-      <w:proofErr w:type="gramStart"/>
-      <w:r>
-        <w:rPr>
-          <w:b/>
-          <w:bCs/>
-          <w:lang w:val="en-US"/>
-        </w:rPr>
-        <w:t>take into account</w:t>
-      </w:r>
-      <w:proofErr w:type="gramEnd"/>
+      <w:r>
+        <w:rPr>
+          <w:b/>
+          <w:bCs/>
+          <w:lang w:val="en-US"/>
+        </w:rPr>
+        <w:t>consider</w:t>
+      </w:r>
       <w:r>
         <w:rPr>
           <w:b/>
@@ -673,7 +697,7 @@
         </w:rPr>
         <w:lastRenderedPageBreak/>
         <w:drawing>
-          <wp:inline distT="0" distB="0" distL="0" distR="0" wp14:anchorId="74815E0B" wp14:editId="5EC76EC1">
+          <wp:inline distT="0" distB="0" distL="0" distR="0" wp14:anchorId="74815E0B" wp14:editId="22010C47">
             <wp:extent cx="4554524" cy="3949200"/>
             <wp:effectExtent l="0" t="0" r="5080" b="635"/>
             <wp:docPr id="2037632910" name="Picture 3"/>
@@ -736,7 +760,7 @@
           <w:lang w:val="en-US"/>
         </w:rPr>
         <w:drawing>
-          <wp:inline distT="0" distB="0" distL="0" distR="0" wp14:anchorId="485B52A5" wp14:editId="16C35603">
+          <wp:inline distT="0" distB="0" distL="0" distR="0" wp14:anchorId="485B52A5" wp14:editId="2B817F65">
             <wp:extent cx="4486312" cy="1997751"/>
             <wp:effectExtent l="0" t="0" r="0" b="0"/>
             <wp:docPr id="378623146" name="Picture 4"/>
@@ -9605,7 +9629,7 @@
             <w:pPr>
               <w:jc w:val="both"/>
               <w:rPr>
-                <w:lang w:val="es-ES"/>
+                <w:lang w:val="en-US"/>
               </w:rPr>
             </w:pPr>
           </w:p>
@@ -9613,7 +9637,7 @@
             <w:pPr>
               <w:jc w:val="both"/>
               <w:rPr>
-                <w:lang w:val="es-ES"/>
+                <w:lang w:val="en-US"/>
               </w:rPr>
             </w:pPr>
           </w:p>
@@ -17608,21 +17632,7 @@
               <w:rPr>
                 <w:lang w:val="en-US"/>
               </w:rPr>
-              <w:t xml:space="preserve"> </w:t>
-            </w:r>
-            <w:proofErr w:type="spellStart"/>
-            <w:r>
-              <w:rPr>
-                <w:lang w:val="en-US"/>
-              </w:rPr>
-              <w:t>te</w:t>
-            </w:r>
-            <w:proofErr w:type="spellEnd"/>
-            <w:r>
-              <w:rPr>
-                <w:lang w:val="en-US"/>
-              </w:rPr>
-              <w:t xml:space="preserve"> </w:t>
+              <w:t xml:space="preserve"> te </w:t>
             </w:r>
             <w:proofErr w:type="spellStart"/>
             <w:proofErr w:type="gramStart"/>
@@ -28122,6 +28132,7 @@
   <w:style w:type="character" w:default="1" w:styleId="DefaultParagraphFont">
     <w:name w:val="Default Paragraph Font"/>
     <w:uiPriority w:val="1"/>
+    <w:semiHidden/>
     <w:unhideWhenUsed/>
   </w:style>
   <w:style w:type="table" w:default="1" w:styleId="TableNormal">

</xml_diff>